<commit_message>
updates to include git repo
</commit_message>
<xml_diff>
--- a/assignments/Design-Weekly-Check-Ins.docx
+++ b/assignments/Design-Weekly-Check-Ins.docx
@@ -370,6 +370,33 @@
       </w:tr>
       <w:tr>
         <w:trPr>
+          <w:trHeight w:val="648" w:hRule="atLeast"/>
+        </w:trPr>
+        <w:tc>
+          <w:tcPr>
+            <w:tcW w:type="dxa" w:w="3312"/>
+            <w:shd w:val="clear" w:color="auto" w:fill="F3F1EA"/>
+          </w:tcPr>
+          <w:p>
+            <w:r/>
+            <w:r>
+              <w:rPr>
+                <w:b/>
+                <w:sz w:val="20"/>
+              </w:rPr>
+              <w:t>GitHub repository link</w:t>
+            </w:r>
+          </w:p>
+        </w:tc>
+        <w:tc>
+          <w:tcPr>
+            <w:tcW w:type="dxa" w:w="6336"/>
+          </w:tcPr>
+          <w:p/>
+        </w:tc>
+      </w:tr>
+      <w:tr>
+        <w:trPr>
           <w:trHeight w:val="1080" w:hRule="atLeast"/>
         </w:trPr>
         <w:tc>
@@ -714,6 +741,33 @@
                 <w:sz w:val="20"/>
               </w:rPr>
               <w:t>Name and class period</w:t>
+            </w:r>
+          </w:p>
+        </w:tc>
+        <w:tc>
+          <w:tcPr>
+            <w:tcW w:type="dxa" w:w="6336"/>
+          </w:tcPr>
+          <w:p/>
+        </w:tc>
+      </w:tr>
+      <w:tr>
+        <w:trPr>
+          <w:trHeight w:val="648" w:hRule="atLeast"/>
+        </w:trPr>
+        <w:tc>
+          <w:tcPr>
+            <w:tcW w:type="dxa" w:w="3312"/>
+            <w:shd w:val="clear" w:color="auto" w:fill="F3F1EA"/>
+          </w:tcPr>
+          <w:p>
+            <w:r/>
+            <w:r>
+              <w:rPr>
+                <w:b/>
+                <w:sz w:val="20"/>
+              </w:rPr>
+              <w:t>GitHub repository link</w:t>
             </w:r>
           </w:p>
         </w:tc>
@@ -1082,6 +1136,33 @@
       </w:tr>
       <w:tr>
         <w:trPr>
+          <w:trHeight w:val="648" w:hRule="atLeast"/>
+        </w:trPr>
+        <w:tc>
+          <w:tcPr>
+            <w:tcW w:type="dxa" w:w="3312"/>
+            <w:shd w:val="clear" w:color="auto" w:fill="F3F1EA"/>
+          </w:tcPr>
+          <w:p>
+            <w:r/>
+            <w:r>
+              <w:rPr>
+                <w:b/>
+                <w:sz w:val="20"/>
+              </w:rPr>
+              <w:t>GitHub repository link</w:t>
+            </w:r>
+          </w:p>
+        </w:tc>
+        <w:tc>
+          <w:tcPr>
+            <w:tcW w:type="dxa" w:w="6336"/>
+          </w:tcPr>
+          <w:p/>
+        </w:tc>
+      </w:tr>
+      <w:tr>
+        <w:trPr>
           <w:trHeight w:val="1080" w:hRule="atLeast"/>
         </w:trPr>
         <w:tc>
@@ -1426,6 +1507,33 @@
                 <w:sz w:val="20"/>
               </w:rPr>
               <w:t>Name and class period</w:t>
+            </w:r>
+          </w:p>
+        </w:tc>
+        <w:tc>
+          <w:tcPr>
+            <w:tcW w:type="dxa" w:w="6336"/>
+          </w:tcPr>
+          <w:p/>
+        </w:tc>
+      </w:tr>
+      <w:tr>
+        <w:trPr>
+          <w:trHeight w:val="648" w:hRule="atLeast"/>
+        </w:trPr>
+        <w:tc>
+          <w:tcPr>
+            <w:tcW w:type="dxa" w:w="3312"/>
+            <w:shd w:val="clear" w:color="auto" w:fill="F3F1EA"/>
+          </w:tcPr>
+          <w:p>
+            <w:r/>
+            <w:r>
+              <w:rPr>
+                <w:b/>
+                <w:sz w:val="20"/>
+              </w:rPr>
+              <w:t>GitHub repository link</w:t>
             </w:r>
           </w:p>
         </w:tc>
@@ -1794,6 +1902,33 @@
       </w:tr>
       <w:tr>
         <w:trPr>
+          <w:trHeight w:val="648" w:hRule="atLeast"/>
+        </w:trPr>
+        <w:tc>
+          <w:tcPr>
+            <w:tcW w:type="dxa" w:w="3312"/>
+            <w:shd w:val="clear" w:color="auto" w:fill="F3F1EA"/>
+          </w:tcPr>
+          <w:p>
+            <w:r/>
+            <w:r>
+              <w:rPr>
+                <w:b/>
+                <w:sz w:val="20"/>
+              </w:rPr>
+              <w:t>GitHub repository link</w:t>
+            </w:r>
+          </w:p>
+        </w:tc>
+        <w:tc>
+          <w:tcPr>
+            <w:tcW w:type="dxa" w:w="6336"/>
+          </w:tcPr>
+          <w:p/>
+        </w:tc>
+      </w:tr>
+      <w:tr>
+        <w:trPr>
           <w:trHeight w:val="1080" w:hRule="atLeast"/>
         </w:trPr>
         <w:tc>

</xml_diff>